<commit_message>
fix: eliminate old U&S stamp from all docx files, add cache busters, and ensure fresh SR Transport stamp and signature
</commit_message>
<xml_diff>
--- a/generated/Invoice-11048.docx
+++ b/generated/Invoice-11048.docx
@@ -2850,14 +2850,14 @@
       </w:tr>
       <w:tr>
         <w:trPr>
-          <w:trHeight w:val="264"/>
+          <w:trHeight w:val="284"/>
         </w:trPr>
         <w:tc>
           <w:tcPr>
             <w:tcW w:w="708" w:type="dxa"/>
             <w:tcBorders>
               <w:top w:val="single" w:sz="8" w:space="0" w:color="000000"/>
-              <w:bottom w:val="single" w:sz="18" w:space="0" w:color="000000"/>
+              <w:bottom w:val="single" w:sz="8" w:space="0" w:color="000000"/>
               <w:right w:val="single" w:sz="18" w:space="0" w:color="000000"/>
             </w:tcBorders>
           </w:tcPr>
@@ -2877,7 +2877,7 @@
             <w:tcBorders>
               <w:top w:val="single" w:sz="8" w:space="0" w:color="000000"/>
               <w:left w:val="single" w:sz="18" w:space="0" w:color="000000"/>
-              <w:bottom w:val="single" w:sz="18" w:space="0" w:color="000000"/>
+              <w:bottom w:val="single" w:sz="8" w:space="0" w:color="000000"/>
               <w:right w:val="single" w:sz="18" w:space="0" w:color="000000"/>
             </w:tcBorders>
           </w:tcPr>
@@ -2897,7 +2897,7 @@
             <w:tcBorders>
               <w:top w:val="single" w:sz="8" w:space="0" w:color="000000"/>
               <w:left w:val="single" w:sz="18" w:space="0" w:color="000000"/>
-              <w:bottom w:val="single" w:sz="18" w:space="0" w:color="000000"/>
+              <w:bottom w:val="single" w:sz="8" w:space="0" w:color="000000"/>
               <w:right w:val="single" w:sz="18" w:space="0" w:color="000000"/>
             </w:tcBorders>
           </w:tcPr>
@@ -2917,7 +2917,7 @@
             <w:tcBorders>
               <w:top w:val="single" w:sz="8" w:space="0" w:color="000000"/>
               <w:left w:val="single" w:sz="18" w:space="0" w:color="000000"/>
-              <w:bottom w:val="single" w:sz="18" w:space="0" w:color="000000"/>
+              <w:bottom w:val="single" w:sz="8" w:space="0" w:color="000000"/>
               <w:right w:val="single" w:sz="18" w:space="0" w:color="000000"/>
             </w:tcBorders>
           </w:tcPr>
@@ -2937,7 +2937,7 @@
             <w:tcBorders>
               <w:top w:val="single" w:sz="8" w:space="0" w:color="000000"/>
               <w:left w:val="single" w:sz="18" w:space="0" w:color="000000"/>
-              <w:bottom w:val="single" w:sz="18" w:space="0" w:color="000000"/>
+              <w:bottom w:val="single" w:sz="8" w:space="0" w:color="000000"/>
               <w:right w:val="single" w:sz="18" w:space="0" w:color="000000"/>
             </w:tcBorders>
           </w:tcPr>
@@ -2957,7 +2957,7 @@
             <w:tcBorders>
               <w:top w:val="single" w:sz="8" w:space="0" w:color="000000"/>
               <w:left w:val="single" w:sz="18" w:space="0" w:color="000000"/>
-              <w:bottom w:val="single" w:sz="18" w:space="0" w:color="000000"/>
+              <w:bottom w:val="single" w:sz="8" w:space="0" w:color="000000"/>
               <w:right w:val="single" w:sz="18" w:space="0" w:color="000000"/>
             </w:tcBorders>
           </w:tcPr>
@@ -2977,7 +2977,7 @@
             <w:tcBorders>
               <w:top w:val="single" w:sz="8" w:space="0" w:color="000000"/>
               <w:left w:val="single" w:sz="18" w:space="0" w:color="000000"/>
-              <w:bottom w:val="single" w:sz="18" w:space="0" w:color="000000"/>
+              <w:bottom w:val="single" w:sz="8" w:space="0" w:color="000000"/>
               <w:right w:val="single" w:sz="18" w:space="0" w:color="000000"/>
             </w:tcBorders>
           </w:tcPr>
@@ -2997,7 +2997,7 @@
             <w:tcBorders>
               <w:top w:val="single" w:sz="8" w:space="0" w:color="000000"/>
               <w:left w:val="single" w:sz="18" w:space="0" w:color="000000"/>
-              <w:bottom w:val="single" w:sz="18" w:space="0" w:color="000000"/>
+              <w:bottom w:val="single" w:sz="8" w:space="0" w:color="000000"/>
               <w:right w:val="single" w:sz="18" w:space="0" w:color="000000"/>
             </w:tcBorders>
           </w:tcPr>
@@ -3017,7 +3017,7 @@
             <w:tcBorders>
               <w:top w:val="single" w:sz="8" w:space="0" w:color="000000"/>
               <w:left w:val="single" w:sz="18" w:space="0" w:color="000000"/>
-              <w:bottom w:val="single" w:sz="18" w:space="0" w:color="000000"/>
+              <w:bottom w:val="single" w:sz="8" w:space="0" w:color="000000"/>
               <w:right w:val="single" w:sz="18" w:space="0" w:color="000000"/>
             </w:tcBorders>
           </w:tcPr>
@@ -3037,7 +3037,7 @@
             <w:tcBorders>
               <w:top w:val="single" w:sz="8" w:space="0" w:color="000000"/>
               <w:left w:val="single" w:sz="18" w:space="0" w:color="000000"/>
-              <w:bottom w:val="single" w:sz="24" w:space="0" w:color="000000"/>
+              <w:bottom w:val="single" w:sz="8" w:space="0" w:color="000000"/>
               <w:right w:val="single" w:sz="18" w:space="0" w:color="000000"/>
             </w:tcBorders>
           </w:tcPr>
@@ -3057,7 +3057,7 @@
             <w:tcBorders>
               <w:top w:val="single" w:sz="8" w:space="0" w:color="000000"/>
               <w:left w:val="single" w:sz="18" w:space="0" w:color="000000"/>
-              <w:bottom w:val="single" w:sz="24" w:space="0" w:color="000000"/>
+              <w:bottom w:val="single" w:sz="8" w:space="0" w:color="000000"/>
               <w:right w:val="single" w:sz="18" w:space="0" w:color="000000"/>
             </w:tcBorders>
           </w:tcPr>
@@ -3077,7 +3077,7 @@
             <w:tcBorders>
               <w:top w:val="single" w:sz="8" w:space="0" w:color="000000"/>
               <w:left w:val="single" w:sz="18" w:space="0" w:color="000000"/>
-              <w:bottom w:val="single" w:sz="24" w:space="0" w:color="000000"/>
+              <w:bottom w:val="single" w:sz="8" w:space="0" w:color="000000"/>
               <w:right w:val="single" w:sz="18" w:space="0" w:color="000000"/>
             </w:tcBorders>
           </w:tcPr>
@@ -3097,7 +3097,7 @@
             <w:tcBorders>
               <w:top w:val="single" w:sz="8" w:space="0" w:color="000000"/>
               <w:left w:val="single" w:sz="18" w:space="0" w:color="000000"/>
-              <w:bottom w:val="single" w:sz="24" w:space="0" w:color="000000"/>
+              <w:bottom w:val="single" w:sz="8" w:space="0" w:color="000000"/>
             </w:tcBorders>
           </w:tcPr>
           <w:p>

</xml_diff>